<commit_message>
Register full-scope raw inputs and document remaining readiness blockers.
</commit_message>
<xml_diff>
--- a/docs/Capstone_Kickoff_Workbook_Serhii_Diadechko.docx
+++ b/docs/Capstone_Kickoff_Workbook_Serhii_Diadechko.docx
@@ -3754,6 +3754,19 @@
       </w:pPr>
       <w:r>
         <w:t>☒ docs/task_list.md for data collection and analysis</w:t>
+      </w:r>
+    </w:p>
+    <w:p>
+      <w:pPr>
+        <w:pStyle w:val="Heading1"/>
+      </w:pPr>
+      <w:r>
+        <w:t>Canonical design update</w:t>
+      </w:r>
+    </w:p>
+    <w:p>
+      <w:r>
+        <w:t>This addendum supersedes earlier conflicting design and source wording while preserving the original completed course answers as historical context. It does not claim that the historical tables themselves were converted. One EPSG:3763 1 km cell-year is the only analytical unit; 2 km is an outward context buffer. Train T=2015–2019, validate T=2020–2021, and reserve T=2022–2024 (outcomes 2023–2025) for final temporal test. The 2023→2024 artifact is a data-contract/pipeline feasibility pilot only. The canonical schema stores identifiers and geometry separately, with seven predictors: built_up_share, forest_shrub_share_2km, mean_slope_2km, fire_years_previous_10y_2km, warm_season_mean_2m_temperature_c, warm_season_total_precipitation_mm, and warm_season_mean_soil_water_layer1. The continuous target is burned_share_next_year; burned_next_year and predicted wildfire probability are deferred until target-distribution review and a documented threshold. Copernicus CLC governs MVP land cover and Copernicus DEM GLO-30 governs static 2 km slope context.</w:t>
       </w:r>
     </w:p>
     <w:sectPr>

</xml_diff>

<commit_message>
Evaluate frozen hurdle model and update final documentation
</commit_message>
<xml_diff>
--- a/docs/Capstone_Kickoff_Workbook_Serhii_Diadechko.docx
+++ b/docs/Capstone_Kickoff_Workbook_Serhii_Diadechko.docx
@@ -3767,6 +3767,34 @@
     <w:p>
       <w:r>
         <w:t>This addendum supersedes earlier conflicting design and source wording while preserving the original completed course answers as historical context. It does not claim that the historical tables themselves were converted. One EPSG:3763 1 km cell-year is the only analytical unit; 2 km is an outward context buffer. Train T=2015–2019, validate T=2020–2021, and reserve T=2022–2024 (outcomes 2023–2025) for final temporal test. The 2023→2024 artifact is a data-contract/pipeline feasibility pilot only. The canonical schema stores identifiers and geometry separately, with seven predictors: built_up_share, forest_shrub_share_2km, mean_slope_2km, fire_years_previous_10y_2km, warm_season_mean_2m_temperature_c, warm_season_total_precipitation_mm, and warm_season_mean_soil_water_layer1. The continuous target is burned_share_next_year; burned_next_year and predicted wildfire probability are deferred until target-distribution review and a documented threshold. Copernicus CLC governs MVP land cover and Copernicus DEM GLO-30 governs static 2 km slope context.</w:t>
+      </w:r>
+    </w:p>
+    <w:p>
+      <w:r>
+        <w:br w:type="page"/>
+      </w:r>
+    </w:p>
+    <w:p>
+      <w:pPr>
+        <w:pStyle w:val="Heading1"/>
+      </w:pPr>
+      <w:r>
+        <w:t>Final modelling update</w:t>
+      </w:r>
+    </w:p>
+    <w:p>
+      <w:r>
+        <w:t>This addendum supersedes earlier conflicting project-status wording while preserving the completed course answers and tables as historical context. It does not claim that those historical tables were converted.</w:t>
+      </w:r>
+    </w:p>
+    <w:p>
+      <w:r>
+        <w:t>The completed evaluation fits the frozen nine-feature hurdle and historical recurrence baseline on T=2010-2019, validates them on T=2020-2021, and uses one frozen final temporal test at T=2022-2024. The nine-feature hurdle has lower held-out all-row MAE and stronger burned-share-mass capture than the baseline, but it underpredicts the unusually high observed mean burned share in T=2024.</w:t>
+      </w:r>
+    </w:p>
+    <w:p>
+      <w:r>
+        <w:t>The retained output is therefore a continuous comparative research model, not a probability, safety rating, property-level forecast, or purchase recommendation. The buyer-facing capstone output remains historical screening: 1 km mainland grid cells with fire recurrence measured in a 2 km context. The continuous target is burned_share_next_year; burned_next_year remains deferred. See reports/validation/model_final_decision.md.</w:t>
       </w:r>
     </w:p>
     <w:sectPr>

</xml_diff>